<commit_message>
Update on portfolio -  v1.1
</commit_message>
<xml_diff>
--- a/assets/resume/Randy_Odawutey_CV.docx
+++ b/assets/resume/Randy_Odawutey_CV.docx
@@ -130,7 +130,13 @@
         <w:t>📍</w:t>
       </w:r>
       <w:r>
-        <w:t xml:space="preserve"> Kumasi, Ghana</w:t>
+        <w:t xml:space="preserve"> </w:t>
+      </w:r>
+      <w:r>
+        <w:t>Accra</w:t>
+      </w:r>
+      <w:r>
+        <w:t>, Ghana</w:t>
       </w:r>
     </w:p>
     <w:p>
@@ -431,6 +437,28 @@
     </w:p>
     <w:p>
       <w:pPr>
+        <w:numPr>
+          <w:ilvl w:val="0"/>
+          <w:numId w:val="3"/>
+        </w:numPr>
+      </w:pPr>
+      <w:r>
+        <w:t>React</w:t>
+      </w:r>
+    </w:p>
+    <w:p>
+      <w:pPr>
+        <w:numPr>
+          <w:ilvl w:val="0"/>
+          <w:numId w:val="3"/>
+        </w:numPr>
+      </w:pPr>
+      <w:r>
+        <w:t>PHP</w:t>
+      </w:r>
+    </w:p>
+    <w:p>
+      <w:pPr>
         <w:rPr>
           <w:b/>
           <w:bCs/>
@@ -549,40 +577,32 @@
     </w:p>
     <w:p>
       <w:pPr>
-        <w:rPr>
-          <w:b/>
-          <w:bCs/>
-        </w:rPr>
-      </w:pPr>
-      <w:r>
-        <w:rPr>
-          <w:b/>
-          <w:bCs/>
-        </w:rPr>
-        <w:t>Operating Systems</w:t>
-      </w:r>
-    </w:p>
-    <w:p>
-      <w:pPr>
-        <w:numPr>
-          <w:ilvl w:val="0"/>
-          <w:numId w:val="6"/>
-        </w:numPr>
-      </w:pPr>
-      <w:r>
-        <w:t xml:space="preserve">Linux (Ubuntu) </w:t>
-      </w:r>
-    </w:p>
-    <w:p>
-      <w:pPr>
-        <w:numPr>
-          <w:ilvl w:val="0"/>
-          <w:numId w:val="6"/>
-        </w:numPr>
-      </w:pPr>
-      <w:r>
-        <w:t xml:space="preserve">Windows </w:t>
-      </w:r>
+        <w:numPr>
+          <w:ilvl w:val="0"/>
+          <w:numId w:val="5"/>
+        </w:numPr>
+      </w:pPr>
+      <w:proofErr w:type="spellStart"/>
+      <w:r>
+        <w:t>Vercel</w:t>
+      </w:r>
+      <w:proofErr w:type="spellEnd"/>
+    </w:p>
+    <w:p>
+      <w:pPr>
+        <w:numPr>
+          <w:ilvl w:val="0"/>
+          <w:numId w:val="5"/>
+        </w:numPr>
+      </w:pPr>
+      <w:r>
+        <w:t>Netlify</w:t>
+      </w:r>
+    </w:p>
+    <w:p>
+      <w:pPr>
+        <w:ind w:left="360"/>
+      </w:pPr>
     </w:p>
     <w:p>
       <w:pPr>
@@ -607,7 +627,6 @@
         </w:numPr>
       </w:pPr>
       <w:r>
-        <w:lastRenderedPageBreak/>
         <w:t xml:space="preserve">Electronic Troubleshooting </w:t>
       </w:r>
     </w:p>
@@ -878,6 +897,7 @@
         </w:numPr>
       </w:pPr>
       <w:r>
+        <w:lastRenderedPageBreak/>
         <w:t xml:space="preserve">Designed workflows aimed at improving market access and business opportunities for farmers. </w:t>
       </w:r>
     </w:p>
@@ -900,7 +920,6 @@
         </w:numPr>
       </w:pPr>
       <w:r>
-        <w:lastRenderedPageBreak/>
         <w:t xml:space="preserve">Focused on solving agricultural supply chain and market-access challenges. </w:t>
       </w:r>
     </w:p>
@@ -1166,6 +1185,7 @@
           <w:b/>
           <w:bCs/>
         </w:rPr>
+        <w:lastRenderedPageBreak/>
         <w:t>Electronics Technician Apprentice</w:t>
       </w:r>
     </w:p>
@@ -1197,7 +1217,6 @@
         </w:numPr>
       </w:pPr>
       <w:r>
-        <w:lastRenderedPageBreak/>
         <w:t xml:space="preserve">Built and tested basic electronic circuits. </w:t>
       </w:r>
     </w:p>
@@ -1492,6 +1511,7 @@
         </w:numPr>
       </w:pPr>
       <w:r>
+        <w:lastRenderedPageBreak/>
         <w:t xml:space="preserve">Web Development Bootcamp </w:t>
       </w:r>
     </w:p>
@@ -1529,7 +1549,6 @@
         </w:numPr>
       </w:pPr>
       <w:r>
-        <w:lastRenderedPageBreak/>
         <w:t>Claude Code 101</w:t>
       </w:r>
     </w:p>

</xml_diff>